<commit_message>
Apply template-fidelity review fixes; update review notes
- Removed invented wording (best-efforts support, equipment refund exception,
  no-advertising-cookies representation narrowed)
- Restored protective language from the source templates: MSA customer
  warranty list and tax duties, Plaid good-standing representation, privacy
  policy "not responsible for recipients' use" sentence
- Added Zendesk support-widget disclosure per the privacy template structure
- Fixed DPA Annex 1 scoping and safeguards wording; Cookie Notice control
  instructions no longer circular
- REVIEW-NOTES changelog and attorney items updated; docx rebuilt

Co-Authored-By: Claude Fable 5.1 <noreply@anthropic.com>
Claude-Session: https://claude.ai/code/session_01QEosvSWHrEk4K1Z5DJ1aNH
</commit_message>
<xml_diff>
--- a/output/docx/REVIEW-NOTES.docx
+++ b/output/docx/REVIEW-NOTES.docx
@@ -495,7 +495,16 @@
           <w:p>
             <w:r/>
             <w:r>
-              <w:t>New: Organizations, Administrator, Authorized Users; responsibility for Authorized Users and "credentials cannot be shared" taken from the MSA.</w:t>
+              <w:t xml:space="preserve">New: Organizations, Administrator, Authorized Users; responsibility for Authorized Users and "credentials cannot be shared" taken from the MSA. The sentence deeming "you" to include the business an Organization represents is </w:t>
+            </w:r>
+            <w:r>
+              <w:rPr>
+                <w:b/>
+              </w:rPr>
+              <w:t>new language</w:t>
+            </w:r>
+            <w:r>
+              <w:t>.</w:t>
             </w:r>
           </w:p>
         </w:tc>
@@ -574,7 +583,7 @@
           <w:p>
             <w:r/>
             <w:r>
-              <w:t>Added restrictions (v)–(ix): circumvention (from MSA §3.1(e)), sham invoices/fraud, sanctions/AML/export, malware, credential sharing. (vi)–(ix) are new language at the founder's request for a payments product.</w:t>
+              <w:t>Added restrictions (v)–(x): circumvention (from MSA §3.1(e)), sham invoices/fraud, sanctions/AML/export, malware, credential sharing, fee circumvention. (vi)–(x) are new language at the founder's request for a payments product.</w:t>
             </w:r>
           </w:p>
         </w:tc>
@@ -609,7 +618,7 @@
           <w:p>
             <w:r/>
             <w:r>
-              <w:t>Kept "no support obligation"; added "best-efforts" sentence.</w:t>
+              <w:t>Kept verbatim ("no support obligation").</w:t>
             </w:r>
           </w:p>
         </w:tc>
@@ -703,7 +712,7 @@
           <w:p>
             <w:r/>
             <w:r>
-              <w:t>MSA §4.2–4.3</w:t>
+              <w:t>MSA §4.2–4.3, §6.3</w:t>
             </w:r>
           </w:p>
         </w:tc>
@@ -714,7 +723,7 @@
           <w:p>
             <w:r/>
             <w:r>
-              <w:t>Customer Data ownership, license to Company, customer responsibility for data and consents, Aggregated Data — adapted from the MSA with product-specific examples.</w:t>
+              <w:t>Customer Data ownership, license to Company, customer responsibility for data and consents, the MSA Customer Warranty list (no infringement, defamation, unlawful content, malware; Company may monitor), Aggregated Data — adapted from the MSA with product-specific examples. Customer Data expressly excludes Chexbill Payments application data and usage data (handled under the Privacy Policy). The MSA's right to make Aggregated Data public was not carried (founder: analytics and improvement only).</w:t>
             </w:r>
           </w:p>
         </w:tc>
@@ -907,7 +916,16 @@
           <w:p>
             <w:r/>
             <w:r>
-              <w:t>Trial, auto-renewal, payment via CardConnect, cancellation, no refunds (MSA §5.3 "non-refundable"), 30-day price-change notice (MSA §5.1), 7-day grace then suspension (MSA §5.4 was 30 days), taxes (MSA §5.2). Auto-renewal sentence in capitals added as a conspicuous disclosure.</w:t>
+              <w:t xml:space="preserve">Trial, auto-renewal, payment via CardConnect, cancellation, no refunds (MSA §5.3 "non-refundable", no exceptions), 30-day price-change notice (MSA §5.1), 7-day grace then suspension of the Organization (MSA §5.4 was 30 days; interest dropped and "no interest" stated), taxes (MSA §5.2 duties to pay, reimburse, and notify of exemption changes carried over). Auto-renewal sentence in capitals added as a conspicuous disclosure. Trial, cancellation, and payment-method sentences are </w:t>
+            </w:r>
+            <w:r>
+              <w:rPr>
+                <w:b/>
+              </w:rPr>
+              <w:t>new language</w:t>
+            </w:r>
+            <w:r>
+              <w:t>.</w:t>
             </w:r>
           </w:p>
         </w:tc>
@@ -951,7 +969,7 @@
               <w:t>new language</w:t>
             </w:r>
             <w:r>
-              <w:t>: role as software provider/referral partner, merchant agreement with CardConnect/Fiserv governs processing, onboarding data, fees per Pricing Schedule collected by the Processor, equipment billed by Chexbill, merchant obligations, Payors.</w:t>
+              <w:t>: role as software provider/referral partner of the "Payment Processor" (named so as not to collide with the DPA's statutory term "Processor"), merchant agreement with CardConnect/Fiserv governs processing, onboarding data collected on Chexbill's own behalf and deleted after onboarding, fees per Pricing Schedule collected by the Payment Processor, equipment billed by Chexbill (non-refundable), merchant obligations, Payors (including that a Payor's use of a payment page is subject to the Terms to the extent applicable). Carries an [ATTORNEY REVIEW] marker.</w:t>
             </w:r>
           </w:p>
         </w:tc>
@@ -1021,7 +1039,7 @@
           <w:p>
             <w:r/>
             <w:r>
-              <w:t>Connected bank accounts via Plaid, with the MSA's representations and no-liability language; Plaid End User Privacy Policy referenced.</w:t>
+              <w:t>Connected bank accounts via Plaid, with the MSA's representations (entitlement, good standing, acknowledgement) and no-liability language; Plaid End User Privacy Policy referenced.</w:t>
             </w:r>
           </w:p>
         </w:tc>
@@ -1056,7 +1074,7 @@
           <w:p>
             <w:r/>
             <w:r>
-              <w:t>Kept; "Payors" added to the other-users and release language.</w:t>
+              <w:t>Kept; "Payors" and the Organization's other Authorized Users added to the other-users language; "Payors" added to the release.</w:t>
             </w:r>
           </w:p>
         </w:tc>
@@ -1219,6 +1237,9 @@
               </w:rPr>
               <w:t>This narrows the company's at-will right for paying customers; founder's choice.</w:t>
             </w:r>
+            <w:r>
+              <w:t xml:space="preserve"> Added that the Payment Processor may suspend Chexbill Payments under the Merchant Agreement. Survival list follows the template's sweep ("Sections 3 through 16") and therefore includes §5 and §6 in full; counsel may wish to narrow it to §5.5, §5.8, §6.5, and §6.6.</w:t>
+            </w:r>
           </w:p>
         </w:tc>
       </w:tr>
@@ -1368,6 +1389,17 @@
       </w:r>
     </w:p>
     <w:p>
+      <w:r>
+        <w:rPr>
+          <w:b/>
+        </w:rPr>
+        <w:t>Hierarchy added:</w:t>
+      </w:r>
+      <w:r>
+        <w:t xml:space="preserve"> §3.1 now states that the DPA controls over the Privacy Policy for personal data processed on the customer's behalf (consistent with DPA §11(a)); §3.3 says the DPA "applies to" that processing. The template MSA's fallback warranty (customer warrants no regulated personal data if no DPA is signed) was not carried; see B.2.9.</w:t>
+      </w:r>
+    </w:p>
+    <w:p>
       <w:pPr>
         <w:pStyle w:val="Heading3"/>
       </w:pPr>
@@ -1403,7 +1435,7 @@
         <w:t>Added:</w:t>
       </w:r>
       <w:r>
-        <w:t xml:space="preserve"> "Chexbill Payments application data". </w:t>
+        <w:t xml:space="preserve"> "Chexbill Payments application data" and "Payor data" (what Chexbill collects from people paying invoices). </w:t>
       </w:r>
       <w:r>
         <w:rPr>
@@ -1412,7 +1444,7 @@
         <w:t>Dropped:</w:t>
       </w:r>
       <w:r>
-        <w:t xml:space="preserve"> Demographic, Relationship, Promotion (no contests), precise geolocation, "chat features" bracket.</w:t>
+        <w:t xml:space="preserve"> Demographic, Relationship, Promotion (no contests), precise geolocation, "chat features" bracket, "salutation", and the metadata-tagging sentence.</w:t>
       </w:r>
     </w:p>
     <w:p>
@@ -1441,7 +1473,18 @@
         <w:t>Dropped:</w:t>
       </w:r>
       <w:r>
-        <w:t xml:space="preserve"> Public sources, Data providers, Partners.</w:t>
+        <w:t xml:space="preserve"> Public sources (none used), Data providers, Partners. "Business partners" removed from the automatic-collection sentence (none exist).</w:t>
+      </w:r>
+    </w:p>
+    <w:p>
+      <w:r>
+        <w:rPr>
+          <w:b/>
+        </w:rPr>
+        <w:t>Tracking section:</w:t>
+      </w:r>
+      <w:r>
+        <w:t xml:space="preserve"> template's "Chat and other AI technologies" paragraph split into a Zendesk support-widget disclosure (template structure, Zendesk named) and a Gemini paragraph; the optional "we contractually require… prohibit training" sentence was replaced by a factual statement about Google's paid API tier (flagged). The template sentence about storing cookie-preference records was dropped (no banner).</w:t>
       </w:r>
     </w:p>
     <w:p>
@@ -1452,7 +1495,7 @@
         <w:t>Uses:</w:t>
       </w:r>
       <w:r>
-        <w:t xml:space="preserve"> kept Service delivery (edited examples; "social features" bullet dropped), Personalization, Service improvement and analytics (Google Analytics example replaced by PostHog), Direct marketing, Compliance and protection, Corporate events, Aggregated data (both bracketed options resolved: "will not attempt to reidentify" kept; AI-training sentence and opt-out dropped), Further uses. </w:t>
+        <w:t xml:space="preserve"> kept Service delivery (edited examples; "social features" bullet dropped), Personalization, Service improvement and analytics (Google Analytics example replaced by PostHog and Sentry), Direct marketing, Compliance and protection, Corporate events, Aggregated data (both bracketed options resolved: "will not attempt to reidentify" kept; AI-training sentence and opt-out dropped), Further uses. </w:t>
       </w:r>
       <w:r>
         <w:rPr>
@@ -1481,7 +1524,7 @@
         <w:t>Added:</w:t>
       </w:r>
       <w:r>
-        <w:t xml:space="preserve"> Bank-connection services (Plaid); "Other users of your organization" replaces the template's "Other users and the public". </w:t>
+        <w:t xml:space="preserve"> Bank-connection services (Plaid); "Other users of your organization" replaces the template's "Other users and the public" and keeps the template's "we are not responsible for any such use" sentence for invoice recipients. </w:t>
       </w:r>
       <w:r>
         <w:rPr>
@@ -1549,10 +1592,10 @@
         <w:rPr>
           <w:b/>
         </w:rPr>
-        <w:t>Added paragraph with no template source:</w:t>
+        <w:t>Added paragraphs with no template source:</w:t>
       </w:r>
       <w:r>
-        <w:t xml:space="preserve"> "Personal information we process on behalf of our customers" (processor-role clarification).</w:t>
+        <w:t xml:space="preserve"> "Personal information we process on behalf of our customers" (processor-role clarification, links to the DPA) and the "Connected financial accounts" choice.</w:t>
       </w:r>
     </w:p>
     <w:p>
@@ -1600,7 +1643,7 @@
         <w:t>Added:</w:t>
       </w:r>
       <w:r>
-        <w:t xml:space="preserve"> "We do not use advertising cookies" sentence; GPC bullet in Your choices (new, mirrors the Privacy Policy); vendor privacy-policy URLs in the table. </w:t>
+        <w:t xml:space="preserve"> "We do not use advertising cookies on our Sites" sentence; GPC bullet in Your choices (new, mirrors the Privacy Policy); vendor privacy-policy URLs and concrete control instructions in the table (template cells were "[ADD]"); Brevo named as the source of marketing-email web beacons (the template's Analytics-row sentence about email beacons was removed so beacons are not attributed to PostHog). The Essential and Functionality row descriptions were lightly expanded with examples. </w:t>
       </w:r>
       <w:r>
         <w:rPr>
@@ -1655,7 +1698,7 @@
         <w:t>Permitted Sensitive Data</w:t>
       </w:r>
       <w:r>
-        <w:t xml:space="preserve">" (vendor TINs for information returns, bank account/routing numbers for payments, connected-account transaction data). </w:t>
+        <w:t xml:space="preserve">" (the customer's and its vendors' TINs and information-return data, bank account/routing numbers for recording or making payments, connected-account transaction data), limited to the features designed to receive them. </w:t>
       </w:r>
       <w:r>
         <w:rPr>
@@ -1664,7 +1707,7 @@
         <w:t>This loosens the template's blanket prohibition; without it the warranty would be breached by ordinary use of the product.</w:t>
       </w:r>
       <w:r>
-        <w:t xml:space="preserve"> Annex 1 "Categories of sensitive data" changed from "None" accordingly, with an "additional safeguards" sentence added. §9(b) adds a sentence pointing to the export feature. </w:t>
+        <w:t xml:space="preserve"> The Personal Data definition now states that Chexbill Payments application data and usage data are processed by Chexbill on its own behalf and are outside the DPA. "Customer Data" is tied to the Terms' definition. "Order form" references removed (self-serve). §9(b) defines the Cessation Date as the date the Organization is deleted (so the DPA's 30-day return window follows the Terms' 365-day/60-day-notice schedule) and points to the export feature; §9(c) adds a backup sentence with a [TBD]. Annex 1 "Categories of sensitive data" changed from "None" to Permitted Sensitive Data; "additional safeguards" points to Annex 3; a "Commercial and financial details" category was added; authentication-detail examples trimmed to what the product uses. Annex 4 lists CardConnect for payments the customer accepts (subscription-fee processing is Chexbill's own activity). </w:t>
       </w:r>
       <w:r>
         <w:rPr>
@@ -1708,7 +1751,7 @@
         <w:t>Backup retention window</w:t>
       </w:r>
       <w:r>
-        <w:t xml:space="preserve"> after deletion (Terms §4.8; Privacy Policy "Retention"). Engineering must state how long Supabase backups retain deleted data.</w:t>
+        <w:t xml:space="preserve"> after deletion (Terms §4.8; Privacy Policy "Retention"; DPA §9(c)). Engineering must state how long Supabase backups retain deleted data.</w:t>
       </w:r>
     </w:p>
     <w:p>
@@ -1733,10 +1776,34 @@
         <w:rPr>
           <w:b/>
         </w:rPr>
-        <w:t>Vendor privacy-policy URLs</w:t>
+        <w:t>URLs supplied by the drafter, not the templates:</w:t>
       </w:r>
       <w:r>
-        <w:t xml:space="preserve"> in the Cookie Notice table and the Fiserv privacy-notice URL in the Privacy Policy were supplied by the drafter, not the templates; verify each resolves before publication.</w:t>
+        <w:t xml:space="preserve"> vendor privacy-policy URLs in the Cookie Notice table; the Fiserv privacy notice cited for CardConnect in the Privacy Policy (CardConnect also publishes its own policy; cite whichever governs merchant and cardholder data); the Plaid End User Privacy Policy; and the internal paths </w:t>
+      </w:r>
+      <w:r>
+        <w:t>https://chexbill.com/privacy</w:t>
+      </w:r>
+      <w:r>
+        <w:t xml:space="preserve">, </w:t>
+      </w:r>
+      <w:r>
+        <w:t>/cookies</w:t>
+      </w:r>
+      <w:r>
+        <w:t xml:space="preserve">, </w:t>
+      </w:r>
+      <w:r>
+        <w:t>/dpa</w:t>
+      </w:r>
+      <w:r>
+        <w:t xml:space="preserve">, and </w:t>
+      </w:r>
+      <w:r>
+        <w:t>/subprocessors</w:t>
+      </w:r>
+      <w:r>
+        <w:t>, which must exist at launch. The allaboutdnt.com, globalprivacycontrol.org, and allaboutcookies.org links come from the template .docx files.</w:t>
       </w:r>
     </w:p>
     <w:p>
@@ -1870,7 +1937,7 @@
         <w:t>DPA execution model.</w:t>
       </w:r>
       <w:r>
-        <w:t xml:space="preserve"> Template is countersigned; for a self-serve product, consider incorporating the DPA by reference in the Terms (Terms §3.3 already points to it) with a countersigned copy on request.</w:t>
+        <w:t xml:space="preserve"> Template is countersigned; for a self-serve product, consider incorporating the DPA by reference in the Terms (Terms §3.3 already says it "applies") with a countersigned copy on request. If the DPA is not made automatic, consider carrying the MSA's fallback warranty (customer warrants that no regulated personal data is submitted absent a DPA) into Terms §3.3. Note also the template's own tension: the DPA's Personal Data definition excludes "Customer's business contacts who are Customer personnel" while Annex 1 lists Customer personnel as data subjects; left as in the template.</w:t>
       </w:r>
     </w:p>
     <w:p>
@@ -1997,6 +2064,34 @@
       </w:r>
       <w:r>
         <w:t xml:space="preserve"> kept on each document per the template authors' request (CC0 permits removal).</w:t>
+      </w:r>
+    </w:p>
+    <w:p>
+      <w:pPr>
+        <w:pStyle w:val="ListNumber"/>
+      </w:pPr>
+      <w:r>
+        <w:rPr>
+          <w:b/>
+        </w:rPr>
+        <w:t>New operative language with no template source</w:t>
+      </w:r>
+      <w:r>
+        <w:t>, for a closer read: Terms §1.2 (deeming the business bound), §4.5–4.8, §5.1–5.4, §6 in full, §12; Privacy Policy processor-role paragraph, Payor-data category, Zendesk and Gemini disclosures, retention bullets, "Connected financial accounts" choice; Cookie Notice "no advertising cookies" statement and GPC item; DPA Permitted Sensitive Data definition, Personal Data carve-out for application and usage data, Cessation Date sentence, backup sentence. Every one of these was checked against the templates in two independent review passes and is listed here so counsel can prioritize.</w:t>
+      </w:r>
+    </w:p>
+    <w:p>
+      <w:pPr>
+        <w:pStyle w:val="ListNumber"/>
+      </w:pPr>
+      <w:r>
+        <w:rPr>
+          <w:b/>
+        </w:rPr>
+        <w:t>Representations of fact the product must keep true:</w:t>
+      </w:r>
+      <w:r>
+        <w:t xml:space="preserve"> no advertising cookies; Gemini paid tier with no training; KYC data deleted after onboarding and never in support tickets, error reports, or logs; marketing-only email beacons; logs kept 365 days; GPC honored.</w:t>
       </w:r>
     </w:p>
     <w:p>

</xml_diff>

<commit_message>
Remove Children section from the Privacy Policy
Xero's and FreshBooks' privacy policies have no children's section, so
drop it and renumber the sections that followed (11-14). The 18+
requirement stays in the Terms Introduction and the "Consumers under
16" statement stays in the state privacy rights notice.

REVIEW-NOTES.md records the removal in A.5 and adds B.2.22 asking
counsel to confirm it. Privacy Policy and review-notes .docx rebuilt.

Co-Authored-By: Claude Opus 5.5 <noreply@anthropic.com>
Claude-Session: https://claude.ai/code/session_01NffTTgyknTvDYNtf4ZhDjg
</commit_message>
<xml_diff>
--- a/output/docx/REVIEW-NOTES.docx
+++ b/output/docx/REVIEW-NOTES.docx
@@ -1738,7 +1738,7 @@
         <w:t>No operative wording was changed</w:t>
       </w:r>
       <w:r>
-        <w:t>: clauses were moved, renumbered, and given headings, and every cross-reference was updated. A paragraph-by-paragraph comparison against the previous draft confirmed that all existing text is still present.</w:t>
+        <w:t>, except that the Privacy Policy's "Children" section was later removed (see below): clauses were moved, renumbered, and given headings, and every cross-reference was updated. A paragraph-by-paragraph comparison against the previous draft confirmed that all other existing text is still present.</w:t>
       </w:r>
     </w:p>
     <w:p>
@@ -2323,7 +2323,7 @@
         <w:t>Privacy Policy.</w:t>
       </w:r>
       <w:r>
-        <w:t xml:space="preserve"> Order follows Xero's Privacy Notice: 1 Who we are and what this policy covers (the former opening paragraph), 2 Personal information we process on behalf of our customers (the former bold-labelled paragraph, Xero's "What this notice doesn't cover"), 3 Personal information we collect, 4 How we use, 5 Tracking &amp; other technologies, 6 How we share, 7 Retention, 8 Security, 9 International data transfer, 10 Your choices, 11 Children, 12 Other sites and services, 13 Changes, 14 How to contact us, 15 State privacy rights notice (regional section last, as in Xero §14). A numbered contents list follows the notice at collection. Every "above"/"below" reference was checked against the new order.</w:t>
+        <w:t xml:space="preserve"> Order follows Xero's Privacy Notice: 1 Who we are and what this policy covers (the former opening paragraph), 2 Personal information we process on behalf of our customers (the former bold-labelled paragraph, Xero's "What this notice doesn't cover"), 3 Personal information we collect, 4 How we use, 5 Tracking &amp; other technologies, 6 How we share, 7 Retention, 8 Security, 9 International data transfer, 10 Your choices, 11 Other sites and services, 12 Changes, 13 How to contact us, 14 State privacy rights notice (regional section last, as in Xero §14). The template's "Children" section was removed at the founder's request because neither Xero's nor FreshBooks' privacy policy has one; the 18+ requirement remains in the Terms Introduction and the "Consumers under 16" statement remains in the state privacy rights notice (see B.2.22). A numbered contents list follows the notice at collection. Every "above"/"below" reference was checked against the new order.</w:t>
       </w:r>
     </w:p>
     <w:p>
@@ -2735,6 +2735,20 @@
       </w:r>
       <w:r>
         <w:t xml:space="preserve"> New, non-operative language modeled on Xero. Confirm (a) that each summary is accurate and does not promise more than its section (for example, the §10 summary on notice before termination and the §11 summary on the liability cap); (b) that the Introduction's convenience-only sentence is enough to keep a summary from being read as a term; and (c) that someone owns keeping the summaries in sync whenever a clause changes.</w:t>
+      </w:r>
+    </w:p>
+    <w:p>
+      <w:pPr>
+        <w:pStyle w:val="ListNumber"/>
+      </w:pPr>
+      <w:r>
+        <w:rPr>
+          <w:b/>
+        </w:rPr>
+        <w:t>Children's privacy section removed (Privacy Policy).</w:t>
+      </w:r>
+      <w:r>
+        <w:t xml:space="preserve"> The template's "Children" section (Service not intended for anyone under 18; deletion of a child's information collected without parental consent) was removed at the founder's request to match Xero and FreshBooks, neither of which has one. Confirm that this is acceptable given that the Service is not directed to children and Chexbill has no actual knowledge of users under 13 (COPPA), and that the remaining statements are sufficient: the 18+ requirement in the Terms Introduction and "Consumers under 16" in the state privacy rights notice.</w:t>
       </w:r>
     </w:p>
     <w:p>

</xml_diff>